<commit_message>
Update user manual: notification bell, self-service password recovery
The manual (both .html and .docx) had gone stale against features already
shipped — it claimed there was no notification center and no self-service
password recovery, and listed both as known gaps in "Observaciones
detectadas". Both exist now (today's NotificationBell, and an earlier
/olvide-password flow), so corrected the FAQ answers and filled in the
previously-empty "3.4 Olvidé mi contraseña" section in the .docx. Also
updated the session-inactivity-expiry gap note, since that shipped earlier
too.

Co-Authored-By: Claude Sonnet 5 <noreply@anthropic.com>
</commit_message>
<xml_diff>
--- a/docs/manual-usuario-processos.docx
+++ b/docs/manual-usuario-processos.docx
@@ -4440,6 +4440,16 @@
       </w:tr>
     </w:tbl>
     <w:p>
+      <w:r>
+        <w:rPr>
+          <w:rFonts w:ascii="Inter" w:hAnsi="Inter"/>
+          <w:color w:val="1F2937"/>
+          <w:sz w:val="21"/>
+        </w:rPr>
+        <w:t>En la pantalla de inicio de sesión, presiona "¿Olvidaste?" junto al campo de contraseña. Ingresa tu correo electrónico y recibirás un enlace para crear una nueva contraseña — no necesitas contactar a tu consultor para este paso. Por seguridad, el sistema muestra el mismo mensaje de confirmación exista o no una cuenta con ese correo.</w:t>
+      </w:r>
+    </w:p>
+    <w:p>
       <w:pPr>
         <w:spacing w:after="120" w:before="300"/>
       </w:pPr>
@@ -5762,7 +5772,7 @@
           <w:sz w:val="21"/>
           <w:szCs w:val="21"/>
         </w:rPr>
-        <w:t xml:space="preserve">El sistema no usa notificaciones push ni un centro de notificaciones separado. Los avisos aparecen incrustados directamente en cada pantalla, con tres formatos:</w:t>
+        <w:t>Los avisos aparecen incrustados directamente en cada pantalla (banners, toasts, estados de campo), y además existe una campana de notificaciones en la esquina superior derecha del encabezado, junto a tu usuario: muestra un contador cuando tienes novedades sin leer (cambios de estado, comentarios, alertas de proceso) y al hacer clic en una te lleva directo al proceso o artefacto correspondiente.</w:t>
       </w:r>
     </w:p>
     <w:tbl>
@@ -33796,7 +33806,7 @@
           <w:sz w:val="20"/>
           <w:szCs w:val="20"/>
         </w:rPr>
-        <w:t xml:space="preserve">No puedes — no existe una función de autoservicio de recuperación de contraseña en la plataforma. Debes contactar a tu consultor de AICOUNTS para que te genere una nueva contraseña temporal.</w:t>
+        <w:t>Sí puedes — en la pantalla de inicio de sesión presiona "¿Olvidaste?" junto al campo de contraseña, ingresa tu correo y sigue el enlace que te llega para crear una nueva. Si no te llega el correo (revisa spam) o el problema persiste, contacta a tu consultor.</w:t>
       </w:r>
     </w:p>
     <w:p>
@@ -37544,7 +37554,7 @@
           <w:sz w:val="21"/>
           <w:szCs w:val="21"/>
         </w:rPr>
-        <w:t xml:space="preserve">No existe una función de recuperación de contraseña por autoservicio (por ejemplo, vía correo electrónico).</w:t>
+        <w:t>Resuelto: recuperación de contraseña por autoservicio vía correo electrónico.</w:t>
       </w:r>
     </w:p>
     <w:p>
@@ -37558,7 +37568,7 @@
           <w:sz w:val="20"/>
           <w:szCs w:val="20"/>
         </w:rPr>
-        <w:t xml:space="preserve">Todo olvido de contraseña depende de contactar manualmente a un Super Administrador, lo que puede generar demoras si esa persona no está disponible.</w:t>
+        <w:t>La plataforma ahora incluye un flujo de "¿Olvidaste tu contraseña?" en el login que envía un enlace de restablecimiento por correo, sin depender de que un Super Administrador la genere manualmente.</w:t>
       </w:r>
     </w:p>
     <w:p>
@@ -37590,7 +37600,7 @@
           <w:sz w:val="21"/>
           <w:szCs w:val="21"/>
         </w:rPr>
-        <w:t xml:space="preserve">No se encontró un mecanismo de expiración de sesión por inactividad configurado explícitamente.</w:t>
+        <w:t>Resuelto: expiración de sesión por inactividad (ventana de 2 horas).</w:t>
       </w:r>
     </w:p>
     <w:p>
@@ -37604,7 +37614,7 @@
           <w:sz w:val="20"/>
           <w:szCs w:val="20"/>
         </w:rPr>
-        <w:t xml:space="preserve">Una sesión iniciada en un dispositivo compartido podría permanecer activa por un tiempo prolongado si el usuario no cierra sesión manualmente.</w:t>
+        <w:t>La plataforma cierra automáticamente la sesión tras 2 horas sin actividad, redirigiendo al login con un aviso de "sesión expirada" — ya no depende de que el usuario recuerde cerrar sesión manualmente en un dispositivo compartido.</w:t>
       </w:r>
     </w:p>
     <w:p>

</xml_diff>